<commit_message>
feat(notfallpass): align docx and pdf wallet fold layout
</commit_message>
<xml_diff>
--- a/app/public/formpacks/notfallpass/templates/a4.docx
+++ b/app/public/formpacks/notfallpass/templates/a4.docx
@@ -2,287 +2,369 @@
 <file path=word/document.xml><?xml version="1.0" encoding="utf-8"?>
 <w:document xmlns:wpc="http://schemas.microsoft.com/office/word/2010/wordprocessingCanvas" xmlns:mo="http://schemas.microsoft.com/office/mac/office/2008/main" xmlns:mc="http://schemas.openxmlformats.org/markup-compatibility/2006" xmlns:mv="urn:schemas-microsoft-com:mac:vml" xmlns:o="urn:schemas-microsoft-com:office:office" xmlns:r="http://schemas.openxmlformats.org/officeDocument/2006/relationships" xmlns:m="http://schemas.openxmlformats.org/officeDocument/2006/math" xmlns:v="urn:schemas-microsoft-com:vml" xmlns:wp14="http://schemas.microsoft.com/office/word/2010/wordprocessingDrawing" xmlns:wp="http://schemas.openxmlformats.org/drawingml/2006/wordprocessingDrawing" xmlns:w10="urn:schemas-microsoft-com:office:word" xmlns:w="http://schemas.openxmlformats.org/wordprocessingml/2006/main" xmlns:w14="http://schemas.microsoft.com/office/word/2010/wordml" xmlns:wpg="http://schemas.microsoft.com/office/word/2010/wordprocessingGroup" xmlns:wpi="http://schemas.microsoft.com/office/word/2010/wordprocessingInk" xmlns:wne="http://schemas.microsoft.com/office/word/2006/wordml" xmlns:wps="http://schemas.microsoft.com/office/word/2010/wordprocessingShape" mc:Ignorable="w14 wp14">
   <w:body>
-    <w:p>
-      <w:pPr>
-        <w:spacing w:after="200"/>
+    <w:tbl>
+      <w:tblPr>
+        <w:tblW w:w="0" w:type="auto"/>
         <w:jc w:val="center"/>
-      </w:pPr>
-      <w:r>
-        <w:rPr>
-          <w:b/>
-          <w:sz w:val="36"/>
-        </w:rPr>
-        <w:t>NOTFALLPASS</w:t>
-      </w:r>
-    </w:p>
-    <w:p>
-      <w:pPr>
-        <w:spacing w:after="200"/>
-      </w:pPr>
-      <w:r>
-        <w:rPr>
-          <w:b w:val="0"/>
-        </w:rPr>
-        <w:t>{{t.notfallpass.title}}</w:t>
-      </w:r>
-    </w:p>
-    <w:p>
-      <w:pPr>
-        <w:spacing w:after="120"/>
-      </w:pPr>
-      <w:r>
-        <w:rPr>
-          <w:b/>
-        </w:rPr>
-        <w:t>{{t.notfallpass.section.person.title}}</w:t>
-      </w:r>
-    </w:p>
-    <w:p>
-      <w:pPr>
-        <w:spacing w:after="40"/>
-      </w:pPr>
-      <w:r>
-        <w:rPr>
-          <w:b w:val="0"/>
-        </w:rPr>
-        <w:t>{{person.name}}</w:t>
-      </w:r>
-    </w:p>
-    <w:p>
-      <w:pPr>
-        <w:spacing w:after="200"/>
-      </w:pPr>
-      <w:r>
-        <w:rPr>
-          <w:b w:val="0"/>
-        </w:rPr>
-        <w:t>{{person.birthDate}}</w:t>
-      </w:r>
-    </w:p>
-    <w:p>
-      <w:pPr>
-        <w:spacing w:after="120"/>
-      </w:pPr>
-      <w:r>
-        <w:rPr>
-          <w:b/>
-        </w:rPr>
-        <w:t>{{t.notfallpass.section.contacts.title}}</w:t>
-      </w:r>
-    </w:p>
-    <w:p>
-      <w:pPr>
-        <w:spacing w:after="0"/>
-      </w:pPr>
-      <w:r>
-        <w:rPr>
-          <w:b w:val="0"/>
-        </w:rPr>
-        <w:t>{{FOR c IN contacts}}</w:t>
-      </w:r>
-    </w:p>
-    <w:p>
-      <w:pPr>
-        <w:spacing w:after="0"/>
-      </w:pPr>
-      <w:r>
-        <w:rPr>
-          <w:b w:val="0"/>
-        </w:rPr>
-        <w:t>{{INS $c.name}} | {{INS $c.phone}} | {{INS $c.relation}}</w:t>
-      </w:r>
-    </w:p>
-    <w:p>
-      <w:pPr>
-        <w:spacing w:after="200"/>
-      </w:pPr>
-      <w:r>
-        <w:rPr>
-          <w:b w:val="0"/>
-        </w:rPr>
-        <w:t>{{END-FOR c}}</w:t>
-      </w:r>
-    </w:p>
-    <w:p>
-      <w:pPr>
-        <w:spacing w:after="120"/>
-      </w:pPr>
-      <w:r>
-        <w:rPr>
-          <w:b/>
-        </w:rPr>
-        <w:t>{{t.notfallpass.section.medications.title}}</w:t>
-      </w:r>
-    </w:p>
-    <w:p>
-      <w:pPr>
-        <w:spacing w:after="0"/>
-      </w:pPr>
-      <w:r>
-        <w:rPr>
-          <w:b w:val="0"/>
-        </w:rPr>
-        <w:t>{{FOR m IN medications}}</w:t>
-      </w:r>
-    </w:p>
-    <w:p>
-      <w:pPr>
-        <w:spacing w:after="0"/>
-      </w:pPr>
-      <w:r>
-        <w:rPr>
-          <w:b w:val="0"/>
-        </w:rPr>
-        <w:t>{{INS $m.name}} | {{INS $m.dosage}} | {{INS $m.schedule}}</w:t>
-      </w:r>
-    </w:p>
-    <w:p>
-      <w:pPr>
-        <w:spacing w:after="200"/>
-      </w:pPr>
-      <w:r>
-        <w:rPr>
-          <w:b w:val="0"/>
-        </w:rPr>
-        <w:t>{{END-FOR m}}</w:t>
-      </w:r>
-    </w:p>
-    <w:p>
-      <w:pPr>
-        <w:spacing w:after="120"/>
-      </w:pPr>
-      <w:r>
-        <w:rPr>
-          <w:b/>
-        </w:rPr>
-        <w:t>{{t.notfallpass.section.symptoms.title}}</w:t>
-      </w:r>
-    </w:p>
-    <w:p>
-      <w:pPr>
-        <w:spacing w:after="200"/>
-      </w:pPr>
-      <w:r>
-        <w:rPr>
-          <w:b w:val="0"/>
-        </w:rPr>
-        <w:t>{{symptoms}}</w:t>
-      </w:r>
-    </w:p>
-    <w:p>
-      <w:pPr>
-        <w:spacing w:after="120"/>
-      </w:pPr>
-      <w:r>
-        <w:rPr>
-          <w:b/>
-        </w:rPr>
-        <w:t>{{t.notfallpass.section.diagnoses.title}}</w:t>
-      </w:r>
-    </w:p>
-    <w:p>
-      <w:pPr>
-        <w:spacing w:after="120"/>
-      </w:pPr>
-      <w:r>
-        <w:rPr>
-          <w:b w:val="0"/>
-        </w:rPr>
-        <w:t>{{diagnoses.formatted}}</w:t>
-      </w:r>
-    </w:p>
-    <w:p>
-      <w:pPr>
-        <w:spacing w:after="0"/>
-      </w:pPr>
-      <w:r>
-        <w:rPr>
-          <w:b w:val="0"/>
-        </w:rPr>
-        <w:t>{{FOR p IN diagnosisParagraphs}}</w:t>
-      </w:r>
-    </w:p>
-    <w:p>
-      <w:pPr>
-        <w:spacing w:after="0"/>
-      </w:pPr>
-      <w:r>
-        <w:rPr>
-          <w:b w:val="0"/>
-        </w:rPr>
-        <w:t>{{INS $p}}</w:t>
-      </w:r>
-    </w:p>
-    <w:p>
-      <w:pPr>
-        <w:spacing w:after="200"/>
-      </w:pPr>
-      <w:r>
-        <w:rPr>
-          <w:b w:val="0"/>
-        </w:rPr>
-        <w:t>{{END-FOR p}}</w:t>
-      </w:r>
-    </w:p>
-    <w:p>
-      <w:pPr>
-        <w:spacing w:after="120"/>
-      </w:pPr>
-      <w:r>
-        <w:rPr>
-          <w:b/>
-        </w:rPr>
-        <w:t>{{t.notfallpass.section.allergies.title}}</w:t>
-      </w:r>
-    </w:p>
-    <w:p>
-      <w:pPr>
-        <w:spacing w:after="200"/>
-      </w:pPr>
-      <w:r>
-        <w:rPr>
-          <w:b w:val="0"/>
-        </w:rPr>
-        <w:t>{{allergies}}</w:t>
-      </w:r>
-    </w:p>
-    <w:p>
-      <w:pPr>
-        <w:spacing w:after="120"/>
-      </w:pPr>
-      <w:r>
-        <w:rPr>
-          <w:b/>
-        </w:rPr>
-        <w:t>{{t.notfallpass.section.doctor.title}}</w:t>
-      </w:r>
-    </w:p>
-    <w:p>
-      <w:pPr>
-        <w:spacing w:after="40"/>
-      </w:pPr>
-      <w:r>
-        <w:rPr>
-          <w:b w:val="0"/>
-        </w:rPr>
-        <w:t>{{doctor.name}}</w:t>
-      </w:r>
-    </w:p>
-    <w:p>
-      <w:pPr>
-        <w:spacing w:after="40"/>
-      </w:pPr>
-      <w:r>
-        <w:rPr>
-          <w:b w:val="0"/>
-        </w:rPr>
-        <w:t>{{doctor.phone}}</w:t>
-      </w:r>
-    </w:p>
+        <w:tblLayout w:type="fixed"/>
+        <w:tblBorders>
+          <w:top w:val="single" w:sz="12" w:space="0" w:color="B8C2CF"/>
+          <w:left w:val="single" w:sz="12" w:space="0" w:color="B8C2CF"/>
+          <w:bottom w:val="single" w:sz="12" w:space="0" w:color="B8C2CF"/>
+          <w:right w:val="single" w:sz="12" w:space="0" w:color="B8C2CF"/>
+          <w:insideH w:val="single" w:sz="12" w:space="0" w:color="B8C2CF"/>
+          <w:insideV w:val="single" w:sz="12" w:space="0" w:color="B8C2CF"/>
+        </w:tblBorders>
+      </w:tblPr>
+      <w:tblGrid>
+        <w:gridCol w:w="7600"/>
+        <w:gridCol w:w="7600"/>
+      </w:tblGrid>
+      <w:tr>
+        <w:trPr>
+          <w:trHeight w:val="4700" w:hRule="atLeast"/>
+        </w:trPr>
+        <w:tc>
+          <w:tcPr>
+            <w:tcW w:w="7600" w:type="dxa"/>
+            <w:tcMar>
+              <w:top w:w="180" w:type="dxa"/>
+              <w:left w:w="180" w:type="dxa"/>
+              <w:bottom w:w="180" w:type="dxa"/>
+              <w:right w:w="180" w:type="dxa"/>
+            </w:tcMar>
+          </w:tcPr>
+          <w:p>
+            <w:pPr>
+              <w:spacing w:after="60"/>
+            </w:pPr>
+            <w:r>
+              <w:rPr>
+                <w:b/>
+                <w:sz w:val="28"/>
+              </w:rPr>
+              <w:t>{{t.notfallpass.title}}</w:t>
+            </w:r>
+          </w:p>
+          <w:p>
+            <w:pPr>
+              <w:spacing w:after="60"/>
+            </w:pPr>
+            <w:r>
+              <w:rPr>
+                <w:sz w:val="18"/>
+              </w:rPr>
+              <w:t>{{t.notfallpass.description}}</w:t>
+            </w:r>
+          </w:p>
+          <w:p>
+            <w:pPr>
+              <w:spacing w:after="120"/>
+            </w:pPr>
+            <w:r>
+              <w:rPr>
+                <w:sz w:val="16"/>
+              </w:rPr>
+              <w:t>{{t.notfallpass.export.foldHint}}</w:t>
+            </w:r>
+          </w:p>
+          <w:p>
+            <w:pPr>
+              <w:spacing w:after="60"/>
+            </w:pPr>
+            <w:r>
+              <w:rPr>
+                <w:b/>
+              </w:rPr>
+              <w:t>{{t.notfallpass.section.person.title}}</w:t>
+            </w:r>
+          </w:p>
+          <w:p>
+            <w:pPr>
+              <w:spacing w:after="40"/>
+            </w:pPr>
+            <w:r>
+              <w:t>{{person.name}}</w:t>
+            </w:r>
+          </w:p>
+          <w:p>
+            <w:pPr>
+              <w:spacing w:after="120"/>
+            </w:pPr>
+            <w:r>
+              <w:t>{{person.birthDate}}</w:t>
+            </w:r>
+          </w:p>
+          <w:p>
+            <w:pPr>
+              <w:spacing w:after="60"/>
+            </w:pPr>
+            <w:r>
+              <w:rPr>
+                <w:b/>
+              </w:rPr>
+              <w:t>{{t.notfallpass.section.diagnoses.title}}</w:t>
+            </w:r>
+          </w:p>
+          <w:p>
+            <w:pPr>
+              <w:spacing w:after="120"/>
+            </w:pPr>
+            <w:r>
+              <w:t>{{diagnoses.formatted}}</w:t>
+            </w:r>
+          </w:p>
+        </w:tc>
+        <w:tc>
+          <w:tcPr>
+            <w:tcW w:w="7600" w:type="dxa"/>
+            <w:tcMar>
+              <w:top w:w="180" w:type="dxa"/>
+              <w:left w:w="180" w:type="dxa"/>
+              <w:bottom w:w="180" w:type="dxa"/>
+              <w:right w:w="180" w:type="dxa"/>
+            </w:tcMar>
+          </w:tcPr>
+          <w:p>
+            <w:pPr>
+              <w:spacing w:after="80"/>
+            </w:pPr>
+            <w:r>
+              <w:rPr>
+                <w:b/>
+                <w:sz w:val="24"/>
+              </w:rPr>
+              <w:t>{{t.notfallpass.export.panel.support.title}}</w:t>
+            </w:r>
+          </w:p>
+          <w:p>
+            <w:pPr>
+              <w:spacing w:after="60"/>
+            </w:pPr>
+            <w:r>
+              <w:rPr>
+                <w:b/>
+              </w:rPr>
+              <w:t>{{t.notfallpass.section.contacts.title}}</w:t>
+            </w:r>
+          </w:p>
+          <w:p>
+            <w:pPr>
+              <w:spacing w:after="0"/>
+            </w:pPr>
+            <w:r>
+              <w:t>{{FOR c IN contacts}}</w:t>
+            </w:r>
+          </w:p>
+          <w:p>
+            <w:pPr>
+              <w:spacing w:after="40"/>
+            </w:pPr>
+            <w:r>
+              <w:t>{{INS $c.name}} | {{INS $c.phone}} | {{INS $c.relation}}</w:t>
+            </w:r>
+          </w:p>
+          <w:p>
+            <w:pPr>
+              <w:spacing w:after="100"/>
+            </w:pPr>
+            <w:r>
+              <w:t>{{END-FOR c}}</w:t>
+            </w:r>
+          </w:p>
+          <w:p>
+            <w:pPr>
+              <w:spacing w:after="60"/>
+            </w:pPr>
+            <w:r>
+              <w:rPr>
+                <w:b/>
+              </w:rPr>
+              <w:t>{{t.notfallpass.section.doctor.title}}</w:t>
+            </w:r>
+          </w:p>
+          <w:p>
+            <w:pPr>
+              <w:spacing w:after="40"/>
+            </w:pPr>
+            <w:r>
+              <w:t>{{doctor.name}}</w:t>
+            </w:r>
+          </w:p>
+          <w:p>
+            <w:pPr>
+              <w:spacing w:after="40"/>
+            </w:pPr>
+            <w:r>
+              <w:t>{{doctor.phone}}</w:t>
+            </w:r>
+          </w:p>
+        </w:tc>
+      </w:tr>
+      <w:tr>
+        <w:trPr>
+          <w:trHeight w:val="4700" w:hRule="atLeast"/>
+        </w:trPr>
+        <w:tc>
+          <w:tcPr>
+            <w:tcW w:w="7600" w:type="dxa"/>
+            <w:tcMar>
+              <w:top w:w="180" w:type="dxa"/>
+              <w:left w:w="180" w:type="dxa"/>
+              <w:bottom w:w="180" w:type="dxa"/>
+              <w:right w:w="180" w:type="dxa"/>
+            </w:tcMar>
+          </w:tcPr>
+          <w:p>
+            <w:pPr>
+              <w:spacing w:after="80"/>
+            </w:pPr>
+            <w:r>
+              <w:rPr>
+                <w:b/>
+                <w:sz w:val="24"/>
+              </w:rPr>
+              <w:t>{{t.notfallpass.export.panel.alerts.title}}</w:t>
+            </w:r>
+          </w:p>
+          <w:p>
+            <w:pPr>
+              <w:spacing w:after="60"/>
+            </w:pPr>
+            <w:r>
+              <w:rPr>
+                <w:b/>
+              </w:rPr>
+              <w:t>{{t.notfallpass.section.symptoms.title}}</w:t>
+            </w:r>
+          </w:p>
+          <w:p>
+            <w:pPr>
+              <w:spacing w:after="120"/>
+            </w:pPr>
+            <w:r>
+              <w:t>{{symptoms}}</w:t>
+            </w:r>
+          </w:p>
+          <w:p>
+            <w:pPr>
+              <w:spacing w:after="60"/>
+            </w:pPr>
+            <w:r>
+              <w:rPr>
+                <w:b/>
+              </w:rPr>
+              <w:t>{{t.notfallpass.section.allergies.title}}</w:t>
+            </w:r>
+          </w:p>
+          <w:p>
+            <w:pPr>
+              <w:spacing w:after="120"/>
+            </w:pPr>
+            <w:r>
+              <w:t>{{allergies}}</w:t>
+            </w:r>
+          </w:p>
+        </w:tc>
+        <w:tc>
+          <w:tcPr>
+            <w:tcW w:w="7600" w:type="dxa"/>
+            <w:tcMar>
+              <w:top w:w="180" w:type="dxa"/>
+              <w:left w:w="180" w:type="dxa"/>
+              <w:bottom w:w="180" w:type="dxa"/>
+              <w:right w:w="180" w:type="dxa"/>
+            </w:tcMar>
+          </w:tcPr>
+          <w:p>
+            <w:pPr>
+              <w:spacing w:after="80"/>
+            </w:pPr>
+            <w:r>
+              <w:rPr>
+                <w:b/>
+                <w:sz w:val="24"/>
+              </w:rPr>
+              <w:t>{{t.notfallpass.export.panel.medications.title}}</w:t>
+            </w:r>
+          </w:p>
+          <w:p>
+            <w:pPr>
+              <w:spacing w:after="60"/>
+            </w:pPr>
+            <w:r>
+              <w:rPr>
+                <w:b/>
+              </w:rPr>
+              <w:t>{{t.notfallpass.section.medications.title}}</w:t>
+            </w:r>
+          </w:p>
+          <w:p>
+            <w:pPr>
+              <w:spacing w:after="0"/>
+            </w:pPr>
+            <w:r>
+              <w:t>{{FOR m IN medications}}</w:t>
+            </w:r>
+          </w:p>
+          <w:p>
+            <w:pPr>
+              <w:spacing w:after="40"/>
+            </w:pPr>
+            <w:r>
+              <w:t>{{INS $m.name}} | {{INS $m.dosage}} | {{INS $m.schedule}}</w:t>
+            </w:r>
+          </w:p>
+          <w:p>
+            <w:pPr>
+              <w:spacing w:after="100"/>
+            </w:pPr>
+            <w:r>
+              <w:t>{{END-FOR m}}</w:t>
+            </w:r>
+          </w:p>
+          <w:p>
+            <w:pPr>
+              <w:spacing w:after="60"/>
+            </w:pPr>
+            <w:r>
+              <w:rPr>
+                <w:b/>
+              </w:rPr>
+              <w:t>{{t.notfallpass.export.panel.medications.detailsHeading}}</w:t>
+            </w:r>
+          </w:p>
+          <w:p>
+            <w:pPr>
+              <w:spacing w:after="0"/>
+            </w:pPr>
+            <w:r>
+              <w:t>{{FOR p IN diagnosisParagraphs}}</w:t>
+            </w:r>
+          </w:p>
+          <w:p>
+            <w:pPr>
+              <w:spacing w:after="40"/>
+            </w:pPr>
+            <w:r>
+              <w:t>{{INS $p}}</w:t>
+            </w:r>
+          </w:p>
+          <w:p>
+            <w:pPr>
+              <w:spacing w:after="40"/>
+            </w:pPr>
+            <w:r>
+              <w:t>{{END-FOR p}}</w:t>
+            </w:r>
+          </w:p>
+        </w:tc>
+      </w:tr>
+    </w:tbl>
     <w:sectPr>
-      <w:pgSz w:w="11906" w:h="16838"/>
-      <w:pgMar w:top="1020" w:right="1020" w:bottom="1020" w:left="1020" w:header="720" w:footer="720" w:gutter="0"/>
-      <w:cols w:space="720"/>
+      <w:pgSz w:w="16838" w:h="11906" w:orient="landscape"/>
+      <w:pgMar w:top="540" w:right="540" w:bottom="540" w:left="540" w:header="720" w:footer="720" w:gutter="0"/>
+      <w:cols w:space="360"/>
       <w:docGrid w:linePitch="360"/>
     </w:sectPr>
   </w:body>

</xml_diff>

<commit_message>
refactor(notfallpass): switch to foldable panel pass layout
</commit_message>
<xml_diff>
--- a/app/public/formpacks/notfallpass/templates/a4.docx
+++ b/app/public/formpacks/notfallpass/templates/a4.docx
@@ -8,121 +8,33 @@
         <w:jc w:val="center"/>
         <w:tblLayout w:type="fixed"/>
         <w:tblBorders>
-          <w:top w:val="single" w:sz="12" w:space="0" w:color="B8C2CF"/>
-          <w:left w:val="single" w:sz="12" w:space="0" w:color="B8C2CF"/>
-          <w:bottom w:val="single" w:sz="12" w:space="0" w:color="B8C2CF"/>
-          <w:right w:val="single" w:sz="12" w:space="0" w:color="B8C2CF"/>
-          <w:insideH w:val="single" w:sz="12" w:space="0" w:color="B8C2CF"/>
-          <w:insideV w:val="single" w:sz="12" w:space="0" w:color="B8C2CF"/>
+          <w:top w:val="single" w:sz="10" w:space="0" w:color="C9B99D"/>
+          <w:left w:val="single" w:sz="10" w:space="0" w:color="C9B99D"/>
+          <w:bottom w:val="single" w:sz="10" w:space="0" w:color="C9B99D"/>
+          <w:right w:val="single" w:sz="10" w:space="0" w:color="C9B99D"/>
+          <w:insideH w:val="single" w:sz="10" w:space="0" w:color="D8CCBA"/>
+          <w:insideV w:val="single" w:sz="10" w:space="0" w:color="D8CCBA"/>
         </w:tblBorders>
       </w:tblPr>
       <w:tblGrid>
-        <w:gridCol w:w="7600"/>
-        <w:gridCol w:w="7600"/>
+        <w:gridCol w:w="3800"/>
+        <w:gridCol w:w="3800"/>
+        <w:gridCol w:w="3800"/>
+        <w:gridCol w:w="3800"/>
       </w:tblGrid>
       <w:tr>
         <w:trPr>
-          <w:trHeight w:val="4700" w:hRule="atLeast"/>
+          <w:trHeight w:val="9100" w:hRule="atLeast"/>
         </w:trPr>
         <w:tc>
           <w:tcPr>
-            <w:tcW w:w="7600" w:type="dxa"/>
+            <w:tcW w:w="3800" w:type="dxa"/>
+            <w:shd w:val="clear" w:color="auto" w:fill="F2EDE4"/>
             <w:tcMar>
-              <w:top w:w="180" w:type="dxa"/>
-              <w:left w:w="180" w:type="dxa"/>
-              <w:bottom w:w="180" w:type="dxa"/>
-              <w:right w:w="180" w:type="dxa"/>
-            </w:tcMar>
-          </w:tcPr>
-          <w:p>
-            <w:pPr>
-              <w:spacing w:after="60"/>
-            </w:pPr>
-            <w:r>
-              <w:rPr>
-                <w:b/>
-                <w:sz w:val="28"/>
-              </w:rPr>
-              <w:t>{{t.notfallpass.title}}</w:t>
-            </w:r>
-          </w:p>
-          <w:p>
-            <w:pPr>
-              <w:spacing w:after="60"/>
-            </w:pPr>
-            <w:r>
-              <w:rPr>
-                <w:sz w:val="18"/>
-              </w:rPr>
-              <w:t>{{t.notfallpass.description}}</w:t>
-            </w:r>
-          </w:p>
-          <w:p>
-            <w:pPr>
-              <w:spacing w:after="120"/>
-            </w:pPr>
-            <w:r>
-              <w:rPr>
-                <w:sz w:val="16"/>
-              </w:rPr>
-              <w:t>{{t.notfallpass.export.foldHint}}</w:t>
-            </w:r>
-          </w:p>
-          <w:p>
-            <w:pPr>
-              <w:spacing w:after="60"/>
-            </w:pPr>
-            <w:r>
-              <w:rPr>
-                <w:b/>
-              </w:rPr>
-              <w:t>{{t.notfallpass.section.person.title}}</w:t>
-            </w:r>
-          </w:p>
-          <w:p>
-            <w:pPr>
-              <w:spacing w:after="40"/>
-            </w:pPr>
-            <w:r>
-              <w:t>{{person.name}}</w:t>
-            </w:r>
-          </w:p>
-          <w:p>
-            <w:pPr>
-              <w:spacing w:after="120"/>
-            </w:pPr>
-            <w:r>
-              <w:t>{{person.birthDate}}</w:t>
-            </w:r>
-          </w:p>
-          <w:p>
-            <w:pPr>
-              <w:spacing w:after="60"/>
-            </w:pPr>
-            <w:r>
-              <w:rPr>
-                <w:b/>
-              </w:rPr>
-              <w:t>{{t.notfallpass.section.diagnoses.title}}</w:t>
-            </w:r>
-          </w:p>
-          <w:p>
-            <w:pPr>
-              <w:spacing w:after="120"/>
-            </w:pPr>
-            <w:r>
-              <w:t>{{diagnoses.formatted}}</w:t>
-            </w:r>
-          </w:p>
-        </w:tc>
-        <w:tc>
-          <w:tcPr>
-            <w:tcW w:w="7600" w:type="dxa"/>
-            <w:tcMar>
-              <w:top w:w="180" w:type="dxa"/>
-              <w:left w:w="180" w:type="dxa"/>
-              <w:bottom w:w="180" w:type="dxa"/>
-              <w:right w:w="180" w:type="dxa"/>
+              <w:top w:w="140" w:type="dxa"/>
+              <w:left w:w="140" w:type="dxa"/>
+              <w:bottom w:w="140" w:type="dxa"/>
+              <w:right w:w="140" w:type="dxa"/>
             </w:tcMar>
           </w:tcPr>
           <w:p>
@@ -134,12 +46,257 @@
                 <w:b/>
                 <w:sz w:val="24"/>
               </w:rPr>
-              <w:t>{{t.notfallpass.export.panel.support.title}}</w:t>
+              <w:t>{{t.notfallpass.export.panel.cover.title}}</w:t>
             </w:r>
           </w:p>
           <w:p>
             <w:pPr>
-              <w:spacing w:after="60"/>
+              <w:spacing w:after="80"/>
+            </w:pPr>
+            <w:r>
+              <w:rPr>
+                <w:sz w:val="17"/>
+              </w:rPr>
+              <w:t>{{t.notfallpass.description}}</w:t>
+            </w:r>
+          </w:p>
+          <w:p>
+            <w:pPr>
+              <w:spacing w:after="120"/>
+            </w:pPr>
+            <w:r>
+              <w:rPr>
+                <w:sz w:val="15"/>
+              </w:rPr>
+              <w:t>{{t.notfallpass.export.foldHint}}</w:t>
+            </w:r>
+          </w:p>
+          <w:p>
+            <w:pPr>
+              <w:spacing w:after="50"/>
+            </w:pPr>
+            <w:r>
+              <w:rPr>
+                <w:b/>
+              </w:rPr>
+              <w:t>{{t.notfallpass.section.person.title}}</w:t>
+            </w:r>
+          </w:p>
+          <w:p>
+            <w:pPr>
+              <w:spacing w:after="35"/>
+            </w:pPr>
+            <w:r>
+              <w:t>{{person.name}}</w:t>
+            </w:r>
+          </w:p>
+          <w:p>
+            <w:pPr>
+              <w:spacing w:after="35"/>
+            </w:pPr>
+            <w:r>
+              <w:t>{{person.birthDate}}</w:t>
+            </w:r>
+          </w:p>
+        </w:tc>
+        <w:tc>
+          <w:tcPr>
+            <w:tcW w:w="3800" w:type="dxa"/>
+            <w:tcMar>
+              <w:top w:w="140" w:type="dxa"/>
+              <w:left w:w="140" w:type="dxa"/>
+              <w:bottom w:w="140" w:type="dxa"/>
+              <w:right w:w="140" w:type="dxa"/>
+            </w:tcMar>
+          </w:tcPr>
+          <w:p>
+            <w:pPr>
+              <w:spacing w:after="80"/>
+            </w:pPr>
+            <w:r>
+              <w:rPr>
+                <w:b/>
+                <w:sz w:val="22"/>
+              </w:rPr>
+              <w:t>{{t.notfallpass.export.panel.diagnoses.title}}</w:t>
+            </w:r>
+          </w:p>
+          <w:p>
+            <w:pPr>
+              <w:spacing w:after="50"/>
+            </w:pPr>
+            <w:r>
+              <w:rPr>
+                <w:b/>
+              </w:rPr>
+              <w:t>{{t.notfallpass.section.diagnoses.title}}</w:t>
+            </w:r>
+          </w:p>
+          <w:p>
+            <w:pPr>
+              <w:spacing w:after="35"/>
+            </w:pPr>
+            <w:r>
+              <w:t>{{diagnoses.formatted}}</w:t>
+            </w:r>
+          </w:p>
+        </w:tc>
+        <w:tc>
+          <w:tcPr>
+            <w:tcW w:w="3800" w:type="dxa"/>
+            <w:tcMar>
+              <w:top w:w="140" w:type="dxa"/>
+              <w:left w:w="140" w:type="dxa"/>
+              <w:bottom w:w="140" w:type="dxa"/>
+              <w:right w:w="140" w:type="dxa"/>
+            </w:tcMar>
+          </w:tcPr>
+          <w:p>
+            <w:pPr>
+              <w:spacing w:after="80"/>
+            </w:pPr>
+            <w:r>
+              <w:rPr>
+                <w:b/>
+                <w:sz w:val="22"/>
+              </w:rPr>
+              <w:t>{{t.notfallpass.export.panel.symptoms.title}}</w:t>
+            </w:r>
+          </w:p>
+          <w:p>
+            <w:pPr>
+              <w:spacing w:after="50"/>
+            </w:pPr>
+            <w:r>
+              <w:rPr>
+                <w:b/>
+              </w:rPr>
+              <w:t>{{t.notfallpass.section.symptoms.title}}</w:t>
+            </w:r>
+          </w:p>
+          <w:p>
+            <w:pPr>
+              <w:spacing w:after="35"/>
+            </w:pPr>
+            <w:r>
+              <w:t>{{symptoms}}</w:t>
+            </w:r>
+          </w:p>
+        </w:tc>
+        <w:tc>
+          <w:tcPr>
+            <w:tcW w:w="3800" w:type="dxa"/>
+            <w:tcMar>
+              <w:top w:w="140" w:type="dxa"/>
+              <w:left w:w="140" w:type="dxa"/>
+              <w:bottom w:w="140" w:type="dxa"/>
+              <w:right w:w="140" w:type="dxa"/>
+            </w:tcMar>
+          </w:tcPr>
+          <w:p>
+            <w:pPr>
+              <w:spacing w:after="80"/>
+            </w:pPr>
+            <w:r>
+              <w:rPr>
+                <w:b/>
+                <w:sz w:val="22"/>
+              </w:rPr>
+              <w:t>{{t.notfallpass.export.panel.medications.title}}</w:t>
+            </w:r>
+          </w:p>
+          <w:p>
+            <w:pPr>
+              <w:spacing w:after="50"/>
+            </w:pPr>
+            <w:r>
+              <w:rPr>
+                <w:b/>
+              </w:rPr>
+              <w:t>{{t.notfallpass.section.medications.title}}</w:t>
+            </w:r>
+          </w:p>
+          <w:p>
+            <w:pPr>
+              <w:spacing w:after="0"/>
+            </w:pPr>
+            <w:r>
+              <w:t>{{FOR m IN medications}}</w:t>
+            </w:r>
+          </w:p>
+          <w:p>
+            <w:pPr>
+              <w:spacing w:after="35"/>
+            </w:pPr>
+            <w:r>
+              <w:t>{{INS $m.name}} | {{INS $m.dosage}} | {{INS $m.schedule}}</w:t>
+            </w:r>
+          </w:p>
+          <w:p>
+            <w:pPr>
+              <w:spacing w:after="35"/>
+            </w:pPr>
+            <w:r>
+              <w:t>{{END-FOR m}}</w:t>
+            </w:r>
+          </w:p>
+        </w:tc>
+      </w:tr>
+    </w:tbl>
+    <w:p>
+      <w:r>
+        <w:br w:type="page"/>
+      </w:r>
+    </w:p>
+    <w:tbl>
+      <w:tblPr>
+        <w:tblW w:w="0" w:type="auto"/>
+        <w:jc w:val="center"/>
+        <w:tblLayout w:type="fixed"/>
+        <w:tblBorders>
+          <w:top w:val="single" w:sz="10" w:space="0" w:color="C9B99D"/>
+          <w:left w:val="single" w:sz="10" w:space="0" w:color="C9B99D"/>
+          <w:bottom w:val="single" w:sz="10" w:space="0" w:color="C9B99D"/>
+          <w:right w:val="single" w:sz="10" w:space="0" w:color="C9B99D"/>
+          <w:insideH w:val="single" w:sz="10" w:space="0" w:color="D8CCBA"/>
+          <w:insideV w:val="single" w:sz="10" w:space="0" w:color="D8CCBA"/>
+        </w:tblBorders>
+      </w:tblPr>
+      <w:tblGrid>
+        <w:gridCol w:w="3800"/>
+        <w:gridCol w:w="3800"/>
+        <w:gridCol w:w="3800"/>
+        <w:gridCol w:w="3800"/>
+      </w:tblGrid>
+      <w:tr>
+        <w:trPr>
+          <w:trHeight w:val="9100" w:hRule="atLeast"/>
+        </w:trPr>
+        <w:tc>
+          <w:tcPr>
+            <w:tcW w:w="3800" w:type="dxa"/>
+            <w:tcMar>
+              <w:top w:w="140" w:type="dxa"/>
+              <w:left w:w="140" w:type="dxa"/>
+              <w:bottom w:w="140" w:type="dxa"/>
+              <w:right w:w="140" w:type="dxa"/>
+            </w:tcMar>
+          </w:tcPr>
+          <w:p>
+            <w:pPr>
+              <w:spacing w:after="80"/>
+            </w:pPr>
+            <w:r>
+              <w:rPr>
+                <w:b/>
+                <w:sz w:val="22"/>
+              </w:rPr>
+              <w:t>{{t.notfallpass.export.panel.contact.title}}</w:t>
+            </w:r>
+          </w:p>
+          <w:p>
+            <w:pPr>
+              <w:spacing w:after="50"/>
             </w:pPr>
             <w:r>
               <w:rPr>
@@ -158,7 +315,7 @@
           </w:p>
           <w:p>
             <w:pPr>
-              <w:spacing w:after="40"/>
+              <w:spacing w:after="35"/>
             </w:pPr>
             <w:r>
               <w:t>{{INS $c.name}} | {{INS $c.phone}} | {{INS $c.relation}}</w:t>
@@ -166,15 +323,38 @@
           </w:p>
           <w:p>
             <w:pPr>
-              <w:spacing w:after="100"/>
+              <w:spacing w:after="35"/>
             </w:pPr>
             <w:r>
               <w:t>{{END-FOR c}}</w:t>
             </w:r>
           </w:p>
+        </w:tc>
+        <w:tc>
+          <w:tcPr>
+            <w:tcW w:w="3800" w:type="dxa"/>
+            <w:tcMar>
+              <w:top w:w="140" w:type="dxa"/>
+              <w:left w:w="140" w:type="dxa"/>
+              <w:bottom w:w="140" w:type="dxa"/>
+              <w:right w:w="140" w:type="dxa"/>
+            </w:tcMar>
+          </w:tcPr>
           <w:p>
             <w:pPr>
-              <w:spacing w:after="60"/>
+              <w:spacing w:after="80"/>
+            </w:pPr>
+            <w:r>
+              <w:rPr>
+                <w:b/>
+                <w:sz w:val="22"/>
+              </w:rPr>
+              <w:t>{{t.notfallpass.export.panel.practice.title}}</w:t>
+            </w:r>
+          </w:p>
+          <w:p>
+            <w:pPr>
+              <w:spacing w:after="50"/>
             </w:pPr>
             <w:r>
               <w:rPr>
@@ -185,7 +365,7 @@
           </w:p>
           <w:p>
             <w:pPr>
-              <w:spacing w:after="40"/>
+              <w:spacing w:after="35"/>
             </w:pPr>
             <w:r>
               <w:t>{{doctor.name}}</w:t>
@@ -193,26 +373,21 @@
           </w:p>
           <w:p>
             <w:pPr>
-              <w:spacing w:after="40"/>
+              <w:spacing w:after="35"/>
             </w:pPr>
             <w:r>
               <w:t>{{doctor.phone}}</w:t>
             </w:r>
           </w:p>
         </w:tc>
-      </w:tr>
-      <w:tr>
-        <w:trPr>
-          <w:trHeight w:val="4700" w:hRule="atLeast"/>
-        </w:trPr>
         <w:tc>
           <w:tcPr>
-            <w:tcW w:w="7600" w:type="dxa"/>
+            <w:tcW w:w="3800" w:type="dxa"/>
             <w:tcMar>
-              <w:top w:w="180" w:type="dxa"/>
-              <w:left w:w="180" w:type="dxa"/>
-              <w:bottom w:w="180" w:type="dxa"/>
-              <w:right w:w="180" w:type="dxa"/>
+              <w:top w:w="140" w:type="dxa"/>
+              <w:left w:w="140" w:type="dxa"/>
+              <w:bottom w:w="140" w:type="dxa"/>
+              <w:right w:w="140" w:type="dxa"/>
             </w:tcMar>
           </w:tcPr>
           <w:p>
@@ -222,33 +397,14 @@
             <w:r>
               <w:rPr>
                 <w:b/>
-                <w:sz w:val="24"/>
+                <w:sz w:val="22"/>
               </w:rPr>
-              <w:t>{{t.notfallpass.export.panel.alerts.title}}</w:t>
+              <w:t>{{t.notfallpass.export.panel.allergies.title}}</w:t>
             </w:r>
           </w:p>
           <w:p>
             <w:pPr>
-              <w:spacing w:after="60"/>
-            </w:pPr>
-            <w:r>
-              <w:rPr>
-                <w:b/>
-              </w:rPr>
-              <w:t>{{t.notfallpass.section.symptoms.title}}</w:t>
-            </w:r>
-          </w:p>
-          <w:p>
-            <w:pPr>
-              <w:spacing w:after="120"/>
-            </w:pPr>
-            <w:r>
-              <w:t>{{symptoms}}</w:t>
-            </w:r>
-          </w:p>
-          <w:p>
-            <w:pPr>
-              <w:spacing w:after="60"/>
+              <w:spacing w:after="50"/>
             </w:pPr>
             <w:r>
               <w:rPr>
@@ -259,7 +415,7 @@
           </w:p>
           <w:p>
             <w:pPr>
-              <w:spacing w:after="120"/>
+              <w:spacing w:after="35"/>
             </w:pPr>
             <w:r>
               <w:t>{{allergies}}</w:t>
@@ -268,12 +424,12 @@
         </w:tc>
         <w:tc>
           <w:tcPr>
-            <w:tcW w:w="7600" w:type="dxa"/>
+            <w:tcW w:w="3800" w:type="dxa"/>
             <w:tcMar>
-              <w:top w:w="180" w:type="dxa"/>
-              <w:left w:w="180" w:type="dxa"/>
-              <w:bottom w:w="180" w:type="dxa"/>
-              <w:right w:w="180" w:type="dxa"/>
+              <w:top w:w="140" w:type="dxa"/>
+              <w:left w:w="140" w:type="dxa"/>
+              <w:bottom w:w="140" w:type="dxa"/>
+              <w:right w:w="140" w:type="dxa"/>
             </w:tcMar>
           </w:tcPr>
           <w:p>
@@ -283,55 +439,20 @@
             <w:r>
               <w:rPr>
                 <w:b/>
-                <w:sz w:val="24"/>
+                <w:sz w:val="22"/>
               </w:rPr>
-              <w:t>{{t.notfallpass.export.panel.medications.title}}</w:t>
+              <w:t>{{t.notfallpass.export.panel.treatment.title}}</w:t>
             </w:r>
           </w:p>
           <w:p>
             <w:pPr>
-              <w:spacing w:after="60"/>
+              <w:spacing w:after="50"/>
             </w:pPr>
             <w:r>
               <w:rPr>
                 <w:b/>
               </w:rPr>
-              <w:t>{{t.notfallpass.section.medications.title}}</w:t>
-            </w:r>
-          </w:p>
-          <w:p>
-            <w:pPr>
-              <w:spacing w:after="0"/>
-            </w:pPr>
-            <w:r>
-              <w:t>{{FOR m IN medications}}</w:t>
-            </w:r>
-          </w:p>
-          <w:p>
-            <w:pPr>
-              <w:spacing w:after="40"/>
-            </w:pPr>
-            <w:r>
-              <w:t>{{INS $m.name}} | {{INS $m.dosage}} | {{INS $m.schedule}}</w:t>
-            </w:r>
-          </w:p>
-          <w:p>
-            <w:pPr>
-              <w:spacing w:after="100"/>
-            </w:pPr>
-            <w:r>
-              <w:t>{{END-FOR m}}</w:t>
-            </w:r>
-          </w:p>
-          <w:p>
-            <w:pPr>
-              <w:spacing w:after="60"/>
-            </w:pPr>
-            <w:r>
-              <w:rPr>
-                <w:b/>
-              </w:rPr>
-              <w:t>{{t.notfallpass.export.panel.medications.detailsHeading}}</w:t>
+              <w:t>{{t.notfallpass.export.panel.treatment.detailsHeading}}</w:t>
             </w:r>
           </w:p>
           <w:p>
@@ -344,7 +465,7 @@
           </w:p>
           <w:p>
             <w:pPr>
-              <w:spacing w:after="40"/>
+              <w:spacing w:after="35"/>
             </w:pPr>
             <w:r>
               <w:t>{{INS $p}}</w:t>
@@ -352,7 +473,7 @@
           </w:p>
           <w:p>
             <w:pPr>
-              <w:spacing w:after="40"/>
+              <w:spacing w:after="35"/>
             </w:pPr>
             <w:r>
               <w:t>{{END-FOR p}}</w:t>

</xml_diff>